<commit_message>
Resume Updage & LinkedIn Banner
</commit_message>
<xml_diff>
--- a/assets/docs/Chintha_Deepak_Resume.docx
+++ b/assets/docs/Chintha_Deepak_Resume.docx
@@ -153,7 +153,16 @@
                 <w:sz w:val="18"/>
                 <w:szCs w:val="18"/>
               </w:rPr>
-              <w:t>Python, C, JavaScript</w:t>
+              <w:t>Python, C</w:t>
+            </w:r>
+            <w:r>
+              <w:rPr>
+                <w:rFonts w:ascii="Calibri" w:eastAsia="Calibri" w:hAnsi="Calibri" w:cs="Calibri"/>
+                <w:color w:val="262626"/>
+                <w:sz w:val="18"/>
+                <w:szCs w:val="18"/>
+              </w:rPr>
+              <w:t>++</w:t>
             </w:r>
           </w:p>
           <w:p>
@@ -256,6 +265,24 @@
               </w:rPr>
               <w:t>OpenCV</w:t>
             </w:r>
+            <w:r>
+              <w:rPr>
+                <w:rFonts w:ascii="Calibri" w:eastAsia="Calibri" w:hAnsi="Calibri" w:cs="Calibri"/>
+                <w:color w:val="262626"/>
+                <w:sz w:val="18"/>
+                <w:szCs w:val="18"/>
+              </w:rPr>
+              <w:t>,</w:t>
+            </w:r>
+            <w:r>
+              <w:rPr>
+                <w:rFonts w:ascii="Calibri" w:eastAsia="Calibri" w:hAnsi="Calibri" w:cs="Calibri"/>
+                <w:color w:val="262626"/>
+                <w:sz w:val="18"/>
+                <w:szCs w:val="18"/>
+              </w:rPr>
+              <w:t>Pandas</w:t>
+            </w:r>
             <w:proofErr w:type="spellEnd"/>
             <w:r>
               <w:rPr>
@@ -265,26 +292,6 @@
                 <w:szCs w:val="18"/>
               </w:rPr>
               <w:t xml:space="preserve">, </w:t>
-            </w:r>
-            <w:proofErr w:type="spellStart"/>
-            <w:r>
-              <w:rPr>
-                <w:rFonts w:ascii="Calibri" w:eastAsia="Calibri" w:hAnsi="Calibri" w:cs="Calibri"/>
-                <w:color w:val="262626"/>
-                <w:sz w:val="18"/>
-                <w:szCs w:val="18"/>
-              </w:rPr>
-              <w:t>Scikit</w:t>
-            </w:r>
-            <w:proofErr w:type="spellEnd"/>
-            <w:r>
-              <w:rPr>
-                <w:rFonts w:ascii="Calibri" w:eastAsia="Calibri" w:hAnsi="Calibri" w:cs="Calibri"/>
-                <w:color w:val="262626"/>
-                <w:sz w:val="18"/>
-                <w:szCs w:val="18"/>
-              </w:rPr>
-              <w:t xml:space="preserve">-learn, Pandas, </w:t>
             </w:r>
             <w:proofErr w:type="spellStart"/>
             <w:r>
@@ -355,17 +362,37 @@
                 <w:sz w:val="18"/>
                 <w:szCs w:val="18"/>
               </w:rPr>
-              <w:t>CoppeliaSim</w:t>
-            </w:r>
-            <w:proofErr w:type="spellEnd"/>
-            <w:r>
-              <w:rPr>
-                <w:rFonts w:ascii="Calibri" w:eastAsia="Calibri" w:hAnsi="Calibri" w:cs="Calibri"/>
-                <w:color w:val="262626"/>
-                <w:sz w:val="18"/>
-                <w:szCs w:val="18"/>
-              </w:rPr>
-              <w:t>, EPSON RC+, Vision Guide, Force Guide, SCARA &amp; 6-axis Robots</w:t>
+              <w:t>Coppel</w:t>
+            </w:r>
+            <w:r>
+              <w:rPr>
+                <w:rFonts w:ascii="Calibri" w:eastAsia="Calibri" w:hAnsi="Calibri" w:cs="Calibri"/>
+                <w:color w:val="262626"/>
+                <w:sz w:val="18"/>
+                <w:szCs w:val="18"/>
+              </w:rPr>
+              <w:t>iaSim</w:t>
+            </w:r>
+            <w:proofErr w:type="spellEnd"/>
+            <w:r>
+              <w:rPr>
+                <w:rFonts w:ascii="Calibri" w:eastAsia="Calibri" w:hAnsi="Calibri" w:cs="Calibri"/>
+                <w:color w:val="262626"/>
+                <w:sz w:val="18"/>
+                <w:szCs w:val="18"/>
+              </w:rPr>
+              <w:t>, EPSON RC+, Vision Guide</w:t>
+            </w:r>
+            <w:bookmarkStart w:id="0" w:name="_GoBack"/>
+            <w:bookmarkEnd w:id="0"/>
+            <w:r>
+              <w:rPr>
+                <w:rFonts w:ascii="Calibri" w:eastAsia="Calibri" w:hAnsi="Calibri" w:cs="Calibri"/>
+                <w:color w:val="262626"/>
+                <w:sz w:val="18"/>
+                <w:szCs w:val="18"/>
+              </w:rPr>
+              <w:t>, SCARA &amp; 6-axis Robots</w:t>
             </w:r>
           </w:p>
           <w:p>
@@ -479,7 +506,16 @@
                 <w:sz w:val="18"/>
                 <w:szCs w:val="18"/>
               </w:rPr>
-              <w:t xml:space="preserve">GitHub, Google </w:t>
+              <w:t>G</w:t>
+            </w:r>
+            <w:r>
+              <w:rPr>
+                <w:rFonts w:ascii="Calibri" w:eastAsia="Calibri" w:hAnsi="Calibri" w:cs="Calibri"/>
+                <w:color w:val="262626"/>
+                <w:sz w:val="18"/>
+                <w:szCs w:val="18"/>
+              </w:rPr>
+              <w:t xml:space="preserve">itHub, Google </w:t>
             </w:r>
             <w:proofErr w:type="spellStart"/>
             <w:r>
@@ -499,19 +535,8 @@
                 <w:sz w:val="18"/>
                 <w:szCs w:val="18"/>
               </w:rPr>
-              <w:t>, Power BI</w:t>
-            </w:r>
-            <w:r>
-              <w:rPr>
-                <w:rFonts w:ascii="Calibri" w:eastAsia="Calibri" w:hAnsi="Calibri" w:cs="Calibri"/>
-                <w:color w:val="262626"/>
-                <w:sz w:val="18"/>
-                <w:szCs w:val="18"/>
-              </w:rPr>
-              <w:t>, MATLAB, ANSYS</w:t>
-            </w:r>
-            <w:bookmarkStart w:id="0" w:name="_GoBack"/>
-            <w:bookmarkEnd w:id="0"/>
+              <w:t>, MATLAB</w:t>
+            </w:r>
           </w:p>
           <w:p>
             <w:pPr>

</xml_diff>